<commit_message>
auto: atualização dashboard — 15/09/2026 08:03 BRT
- Dados Open-Meteo ERA5-Land: 08/2026 incorporados
- Índices oceânicos atualizados (PSL/NOAA)
- SARIMAX x XGBoost comparados e melhor selecionado
- Cenários e BH recalculados
- Relatório executivo regerado
</commit_message>
<xml_diff>
--- a/docs/relatorio-executivo.docx
+++ b/docs/relatorio-executivo.docx
@@ -48,7 +48,7 @@
           <w:color w:val="595959"/>
           <w:sz w:val="17"/>
         </w:rPr>
-        <w:t>Norte do Tocantins  ·  Horizonte set/2026 – ago/2027  ·  Emissão 12/09/2026</w:t>
+        <w:t>Norte do Tocantins  ·  Horizonte set/2026 – ago/2027  ·  Emissão 15/09/2026</w:t>
       </w:r>
     </w:p>
     <w:p>
@@ -179,7 +179,7 @@
           <w:color w:val="000000"/>
           <w:sz w:val="19"/>
         </w:rPr>
-        <w:t xml:space="preserve"> da média histórica de 1.714 mm (1981–2025), com 89,4% de probabilidade de ano seco. O núcleo chuvoso de dezembro a março permanece operacionalmente viável, com volumes </w:t>
+        <w:t xml:space="preserve"> da média histórica de 1.714 mm (1981–2025), com 88,8% de probabilidade de ano seco. O núcleo chuvoso de dezembro a março permanece operacionalmente viável, com volumes </w:t>
       </w:r>
       <w:r>
         <w:rPr>
@@ -675,7 +675,7 @@
                 <w:color w:val="A8322C"/>
                 <w:sz w:val="17"/>
               </w:rPr>
-              <w:t>89,4%</w:t>
+              <w:t>88,8%</w:t>
             </w:r>
           </w:p>
         </w:tc>
@@ -810,7 +810,7 @@
                 <w:color w:val="000000"/>
                 <w:sz w:val="17"/>
               </w:rPr>
-              <w:t>77,1%</w:t>
+              <w:t>76,2%</w:t>
             </w:r>
           </w:p>
         </w:tc>
@@ -947,7 +947,7 @@
                 <w:color w:val="000000"/>
                 <w:sz w:val="17"/>
               </w:rPr>
-              <w:t>63,6%</w:t>
+              <w:t>64,2%</w:t>
             </w:r>
           </w:p>
         </w:tc>
@@ -1082,7 +1082,7 @@
                 <w:color w:val="000000"/>
                 <w:sz w:val="17"/>
               </w:rPr>
-              <w:t>45,9%</w:t>
+              <w:t>45,0%</w:t>
             </w:r>
           </w:p>
         </w:tc>
@@ -1219,7 +1219,7 @@
                 <w:color w:val="000000"/>
                 <w:sz w:val="17"/>
               </w:rPr>
-              <w:t>26,1%</w:t>
+              <w:t>25,9%</w:t>
             </w:r>
           </w:p>
         </w:tc>
@@ -2137,7 +2137,7 @@
           <w:color w:val="000000"/>
           <w:sz w:val="19"/>
         </w:rPr>
-        <w:t>Uma reclassificação do evento para El Niño moderado altera a projeção de 1.287 mm para 1.360 mm e a probabilidade de ano seco de 89,4% para 77,1%, o que redefine a postura da janela de transição.</w:t>
+        <w:t>Uma reclassificação do evento para El Niño moderado altera a projeção de 1.287 mm para 1.360 mm e a probabilidade de ano seco de 88,8% para 76,2%, o que redefine a postura da janela de transição.</w:t>
       </w:r>
     </w:p>
     <w:p>
@@ -2312,7 +2312,7 @@
           <w:color w:val="595959"/>
           <w:sz w:val="15"/>
         </w:rPr>
-        <w:t>Fontes: NOAA/CPC · IRI Columbia · NASA MERRA-2 · ECMWF ERA5-Land (Open-Meteo) · rede de estações Sinobras Florestal. Cenário central classificado pelo pico projetado do Niño 3.4 (2,70 °C). Documento gerado automaticamente em 12/09/2026.</w:t>
+        <w:t>Fontes: NOAA/CPC · IRI Columbia · NASA MERRA-2 · ECMWF ERA5-Land (Open-Meteo) · rede de estações Sinobras Florestal. Cenário central classificado pelo pico projetado do Niño 3.4 (2,70 °C). Documento gerado automaticamente em 15/09/2026.</w:t>
       </w:r>
     </w:p>
     <w:sectPr>

</xml_diff>

<commit_message>
auto: atualização dashboard — 21/09/2026 16:50 BRT
- Dados Open-Meteo ERA5-Land: 08/2026 incorporados
- Índices oceânicos atualizados (PSL/NOAA)
- SARIMAX x XGBoost comparados e melhor selecionado
- Cenários e BH recalculados
- Relatório executivo regerado
</commit_message>
<xml_diff>
--- a/docs/relatorio-executivo.docx
+++ b/docs/relatorio-executivo.docx
@@ -48,7 +48,7 @@
           <w:color w:val="595959"/>
           <w:sz w:val="17"/>
         </w:rPr>
-        <w:t>Norte do Tocantins  ·  Horizonte set/2026 – ago/2027  ·  Emissão 15/09/2026</w:t>
+        <w:t>Norte do Tocantins  ·  Horizonte set/2026 – ago/2027  ·  Emissão 21/09/2026</w:t>
       </w:r>
     </w:p>
     <w:p>
@@ -179,7 +179,7 @@
           <w:color w:val="000000"/>
           <w:sz w:val="19"/>
         </w:rPr>
-        <w:t xml:space="preserve"> da média histórica de 1.714 mm (1981–2025), com 88,8% de probabilidade de ano seco. O núcleo chuvoso de dezembro a março permanece operacionalmente viável, com volumes </w:t>
+        <w:t xml:space="preserve"> da média histórica de 1.714 mm (1981–2025), com 88,1% de probabilidade de ano seco. O núcleo chuvoso de dezembro a março permanece operacionalmente viável, com volumes </w:t>
       </w:r>
       <w:r>
         <w:rPr>
@@ -675,7 +675,7 @@
                 <w:color w:val="A8322C"/>
                 <w:sz w:val="17"/>
               </w:rPr>
-              <w:t>88,8%</w:t>
+              <w:t>88,1%</w:t>
             </w:r>
           </w:p>
         </w:tc>
@@ -810,7 +810,7 @@
                 <w:color w:val="000000"/>
                 <w:sz w:val="17"/>
               </w:rPr>
-              <w:t>76,2%</w:t>
+              <w:t>77,5%</w:t>
             </w:r>
           </w:p>
         </w:tc>
@@ -1082,7 +1082,7 @@
                 <w:color w:val="000000"/>
                 <w:sz w:val="17"/>
               </w:rPr>
-              <w:t>45,0%</w:t>
+              <w:t>45,5%</w:t>
             </w:r>
           </w:p>
         </w:tc>
@@ -1219,7 +1219,7 @@
                 <w:color w:val="000000"/>
                 <w:sz w:val="17"/>
               </w:rPr>
-              <w:t>25,9%</w:t>
+              <w:t>26,2%</w:t>
             </w:r>
           </w:p>
         </w:tc>
@@ -2137,7 +2137,7 @@
           <w:color w:val="000000"/>
           <w:sz w:val="19"/>
         </w:rPr>
-        <w:t>Uma reclassificação do evento para El Niño moderado altera a projeção de 1.287 mm para 1.360 mm e a probabilidade de ano seco de 88,8% para 76,2%, o que redefine a postura da janela de transição.</w:t>
+        <w:t>Uma reclassificação do evento para El Niño moderado altera a projeção de 1.287 mm para 1.360 mm e a probabilidade de ano seco de 88,1% para 77,5%, o que redefine a postura da janela de transição.</w:t>
       </w:r>
     </w:p>
     <w:p>
@@ -2312,7 +2312,7 @@
           <w:color w:val="595959"/>
           <w:sz w:val="15"/>
         </w:rPr>
-        <w:t>Fontes: NOAA/CPC · IRI Columbia · NASA MERRA-2 · ECMWF ERA5-Land (Open-Meteo) · rede de estações Sinobras Florestal. Cenário central classificado pelo pico projetado do Niño 3.4 (2,70 °C). Documento gerado automaticamente em 15/09/2026.</w:t>
+        <w:t>Fontes: NOAA/CPC · IRI Columbia · NASA MERRA-2 · ECMWF ERA5-Land (Open-Meteo) · rede de estações Sinobras Florestal. Cenário central classificado pelo pico projetado do Niño 3.4 (2,70 °C). Documento gerado automaticamente em 21/09/2026.</w:t>
       </w:r>
     </w:p>
     <w:sectPr>

</xml_diff>